<commit_message>
Worksheet kondensatorenergie: edits from the classroom
Changes made in Word by the author, part C:

- task 2 now asks the students to think about the energy of each portion
  while shifting them; transferring the table to Excel becomes an
  optional aside instead of the main instruction
- task 3 has them read the Q-U bar chart in the simulation rather than
  build one in Excel; the question about the meaning of a single bar and
  of the total area stays
- the closing "Zum Merken" box was removed, so the sheet now ends with
  the task that leads to E = 0.5*C*U^2

Co-Authored-By: Claude Opus 5 <noreply@anthropic.com>
</commit_message>
<xml_diff>
--- a/arbeitsblatt-kondensatorenergie.docx
+++ b/arbeitsblatt-kondensatorenergie.docx
@@ -275,20 +275,6 @@
         </w:rPr>
         <w:t>Wende dich nun dem rechten Aufbau zu. Zwischen den Platten liegt die Spannung U, der Plattenabstand beträgt d = 50 cm. Stelle U = 1000 V und q = 2,0 mC ein und ziehe die Ladung von der unteren Platte nach oben.</w:t>
       </w:r>
-      <w:proofErr w:type="spellStart"/>
-      <w:r>
-        <w:rPr>
-          <w:color w:val="1A1A1A"/>
-          <w:lang w:val="de-DE"/>
-        </w:rPr>
-      </w:r>
-      <w:proofErr w:type="spellEnd"/>
-      <w:r>
-        <w:rPr>
-          <w:color w:val="1A1A1A"/>
-          <w:lang w:val="de-DE"/>
-        </w:rPr>
-      </w:r>
     </w:p>
     <w:p>
       <w:pPr>
@@ -333,6 +319,15 @@
         </w:rPr>
         <w:t>Setze auch diese Kraft in W = F · s ein und vereinfache für den Fall, dass die Ladung über den ganzen Plattenabstand verschoben wird, also h = d.</w:t>
       </w:r>
+    </w:p>
+    <w:p>
+      <w:pPr>
+        <w:spacing w:before="160" w:after="60"/>
+        <w:ind w:left="482" w:hanging="482"/>
+        <w:rPr>
+          <w:lang w:val="de-DE"/>
+        </w:rPr>
+      </w:pPr>
     </w:p>
     <w:p>
       <w:pPr>
@@ -667,54 +662,6 @@
     </w:p>
     <w:p>
       <w:pPr>
-        <w:pBdr>
-          <w:bottom w:val="dotted" w:sz="4" w:space="0" w:color="A6A6A6"/>
-        </w:pBdr>
-        <w:spacing w:before="40" w:after="280"/>
-        <w:ind w:left="482"/>
-        <w:rPr>
-          <w:lang w:val="de-DE"/>
-        </w:rPr>
-      </w:pPr>
-    </w:p>
-    <w:p>
-      <w:pPr>
-        <w:pBdr>
-          <w:bottom w:val="dotted" w:sz="4" w:space="0" w:color="A6A6A6"/>
-        </w:pBdr>
-        <w:spacing w:after="280"/>
-        <w:ind w:left="482"/>
-        <w:rPr>
-          <w:lang w:val="de-DE"/>
-        </w:rPr>
-      </w:pPr>
-    </w:p>
-    <w:p>
-      <w:pPr>
-        <w:pBdr>
-          <w:bottom w:val="dotted" w:sz="4" w:space="0" w:color="A6A6A6"/>
-        </w:pBdr>
-        <w:spacing w:after="280"/>
-        <w:ind w:left="482"/>
-        <w:rPr>
-          <w:lang w:val="de-DE"/>
-        </w:rPr>
-      </w:pPr>
-    </w:p>
-    <w:p>
-      <w:pPr>
-        <w:pBdr>
-          <w:bottom w:val="dotted" w:sz="4" w:space="0" w:color="A6A6A6"/>
-        </w:pBdr>
-        <w:spacing w:after="280"/>
-        <w:ind w:left="482"/>
-        <w:rPr>
-          <w:lang w:val="de-DE"/>
-        </w:rPr>
-      </w:pPr>
-    </w:p>
-    <w:p>
-      <w:pPr>
         <w:spacing w:before="160" w:after="60"/>
         <w:ind w:left="482" w:hanging="482"/>
         <w:rPr>
@@ -734,54 +681,6 @@
         </w:rPr>
         <w:t>In der Gleichung W = q · U kommt der Plattenabstand nicht mehr vor, in W = m · g · h steht die Höhe dagegen ausdrücklich. Wie passt das zusammen? Tipp: Was bedeutet U beim Kondensator?</w:t>
       </w:r>
-    </w:p>
-    <w:p>
-      <w:pPr>
-        <w:pBdr>
-          <w:bottom w:val="dotted" w:sz="4" w:space="0" w:color="A6A6A6"/>
-        </w:pBdr>
-        <w:spacing w:before="40" w:after="280"/>
-        <w:ind w:left="482"/>
-        <w:rPr>
-          <w:lang w:val="de-DE"/>
-        </w:rPr>
-      </w:pPr>
-    </w:p>
-    <w:p>
-      <w:pPr>
-        <w:pBdr>
-          <w:bottom w:val="dotted" w:sz="4" w:space="0" w:color="A6A6A6"/>
-        </w:pBdr>
-        <w:spacing w:after="280"/>
-        <w:ind w:left="482"/>
-        <w:rPr>
-          <w:lang w:val="de-DE"/>
-        </w:rPr>
-      </w:pPr>
-    </w:p>
-    <w:p>
-      <w:pPr>
-        <w:pBdr>
-          <w:bottom w:val="dotted" w:sz="4" w:space="0" w:color="A6A6A6"/>
-        </w:pBdr>
-        <w:spacing w:after="280"/>
-        <w:ind w:left="482"/>
-        <w:rPr>
-          <w:lang w:val="de-DE"/>
-        </w:rPr>
-      </w:pPr>
-    </w:p>
-    <w:p>
-      <w:pPr>
-        <w:pBdr>
-          <w:bottom w:val="dotted" w:sz="4" w:space="0" w:color="A6A6A6"/>
-        </w:pBdr>
-        <w:spacing w:after="280"/>
-        <w:ind w:left="482"/>
-        <w:rPr>
-          <w:lang w:val="de-DE"/>
-        </w:rPr>
-      </w:pPr>
     </w:p>
     <w:p>
       <w:pPr>
@@ -988,25 +887,31 @@
         <w:rPr>
           <w:lang w:val="de-DE"/>
         </w:rPr>
-        <w:t xml:space="preserve">Verschiebe alle zehn Portionen. Übertrage die Werte in Excel – mit der Schaltfläche „Tabelle in die Zwischenablage“ kannst du sie direkt einfügen. Ergänze in Excel eine Spalte mit der Energie </w:t>
-      </w:r>
-      <w:r>
-        <w:t>Δ</w:t>
+        <w:t xml:space="preserve">Verschiebe </w:t>
       </w:r>
       <w:r>
         <w:rPr>
           <w:lang w:val="de-DE"/>
         </w:rPr>
-        <w:t xml:space="preserve">E = U · </w:t>
-      </w:r>
-      <w:r>
-        <w:t>Δ</w:t>
+        <w:t xml:space="preserve">nacheinander </w:t>
       </w:r>
       <w:r>
         <w:rPr>
           <w:lang w:val="de-DE"/>
         </w:rPr>
-        <w:t>q für jede Portion und bilde darunter die Summe.</w:t>
+        <w:t xml:space="preserve">alle zehn Portionen. </w:t>
+      </w:r>
+      <w:r>
+        <w:rPr>
+          <w:lang w:val="de-DE"/>
+        </w:rPr>
+        <w:t xml:space="preserve">Überlege dir, wie viel Energie dabei jeweils notwendig ist. </w:t>
+      </w:r>
+      <w:r>
+        <w:rPr>
+          <w:lang w:val="de-DE"/>
+        </w:rPr>
+        <w:t>(Du kannst die Wertetabelle auch in Excel übertragen).</w:t>
       </w:r>
     </w:p>
     <w:p>
@@ -1052,7 +957,13 @@
         <w:rPr>
           <w:lang w:val="de-DE"/>
         </w:rPr>
-        <w:t>Zeichne in Excel ein Q-U-Diagramm als Säulendiagramm – es handelt sich um diskrete Werte, deshalb Säulen und keine durchgezogene Kurve. Überlege dann, was die Fläche einer einzelnen Säule bedeutet und wie sich die insgesamt nötige Energie im Diagramm darstellt.</w:t>
+        <w:t>Betrachte das</w:t>
+      </w:r>
+      <w:r>
+        <w:rPr>
+          <w:lang w:val="de-DE"/>
+        </w:rPr>
+        <w:t xml:space="preserve"> Q-U-Diagramm als Säulendiagramm – es handelt sich um diskrete Werte, deshalb Säulen und keine durchgezogene Kurve. Überlege dann, was die Fläche einer einzelnen Säule bedeutet und wie sich die insgesamt nötige Energie im Diagramm darstellt.</w:t>
       </w:r>
     </w:p>
     <w:p>
@@ -1408,6 +1319,16 @@
         <w:spacing w:before="160" w:after="60"/>
         <w:ind w:left="482" w:hanging="482"/>
         <w:rPr>
+          <w:b/>
+          <w:lang w:val="de-DE"/>
+        </w:rPr>
+      </w:pPr>
+    </w:p>
+    <w:p>
+      <w:pPr>
+        <w:spacing w:before="160" w:after="60"/>
+        <w:ind w:left="482" w:hanging="482"/>
+        <w:rPr>
           <w:lang w:val="de-DE"/>
         </w:rPr>
       </w:pPr>
@@ -1442,7 +1363,7 @@
         <w:pBdr>
           <w:bottom w:val="dotted" w:sz="4" w:space="0" w:color="A6A6A6"/>
         </w:pBdr>
-        <w:spacing w:after="280"/>
+        <w:spacing w:before="40" w:after="280"/>
         <w:ind w:left="482"/>
         <w:rPr>
           <w:lang w:val="de-DE"/>
@@ -1454,7 +1375,7 @@
         <w:pBdr>
           <w:bottom w:val="dotted" w:sz="4" w:space="0" w:color="A6A6A6"/>
         </w:pBdr>
-        <w:spacing w:after="280"/>
+        <w:spacing w:before="40" w:after="280"/>
         <w:ind w:left="482"/>
         <w:rPr>
           <w:lang w:val="de-DE"/>
@@ -1466,98 +1387,13 @@
         <w:pBdr>
           <w:bottom w:val="dotted" w:sz="4" w:space="0" w:color="A6A6A6"/>
         </w:pBdr>
-        <w:spacing w:after="280"/>
+        <w:spacing w:before="40" w:after="280"/>
         <w:ind w:left="482"/>
         <w:rPr>
           <w:lang w:val="de-DE"/>
         </w:rPr>
       </w:pPr>
     </w:p>
-    <w:tbl>
-      <w:tblPr>
-        <w:tblW w:w="0" w:type="auto"/>
-        <w:tblLook w:val="04A0" w:firstRow="1" w:lastRow="0" w:firstColumn="1" w:lastColumn="0" w:noHBand="0" w:noVBand="1"/>
-      </w:tblPr>
-      <w:tblGrid>
-        <w:gridCol w:w="9638"/>
-      </w:tblGrid>
-      <w:tr>
-        <w:tc>
-          <w:tcPr>
-            <w:tcW w:w="9638" w:type="dxa"/>
-            <w:tcBorders>
-              <w:top w:val="single" w:sz="8" w:space="0" w:color="1F4E79"/>
-              <w:left w:val="single" w:sz="18" w:space="0" w:color="1F4E79"/>
-              <w:bottom w:val="single" w:sz="8" w:space="0" w:color="1F4E79"/>
-              <w:right w:val="single" w:sz="8" w:space="0" w:color="1F4E79"/>
-            </w:tcBorders>
-            <w:shd w:val="clear" w:color="auto" w:fill="EAF1F8"/>
-          </w:tcPr>
-          <w:p>
-            <w:pPr>
-              <w:spacing w:after="40"/>
-              <w:rPr>
-                <w:lang w:val="de-DE"/>
-              </w:rPr>
-            </w:pPr>
-            <w:r>
-              <w:rPr>
-                <w:b/>
-                <w:sz w:val="22"/>
-                <w:lang w:val="de-DE"/>
-              </w:rPr>
-              <w:t>Zum Merken</w:t>
-            </w:r>
-          </w:p>
-          <w:p>
-            <w:pPr>
-              <w:spacing w:after="40"/>
-              <w:rPr>
-                <w:lang w:val="de-DE"/>
-              </w:rPr>
-            </w:pPr>
-            <w:r>
-              <w:rPr>
-                <w:b/>
-                <w:sz w:val="22"/>
-                <w:lang w:val="de-DE"/>
-              </w:rPr>
-              <w:t>W = F · s   →   im Schwerefeld:  W = m · g · h      im elektrischen Feld:  W = q · U</w:t>
-            </w:r>
-          </w:p>
-          <w:p>
-            <w:pPr>
-              <w:spacing w:after="40"/>
-              <w:rPr>
-                <w:lang w:val="de-DE"/>
-              </w:rPr>
-            </w:pPr>
-            <w:r>
-              <w:rPr>
-                <w:b/>
-                <w:sz w:val="26"/>
-                <w:lang w:val="de-DE"/>
-              </w:rPr>
-              <w:t>Energie eines geladenen Kondensators:   E = ½ · C · U²</w:t>
-            </w:r>
-          </w:p>
-          <w:p>
-            <w:pPr>
-              <w:spacing w:after="40"/>
-              <w:rPr>
-                <w:lang w:val="de-DE"/>
-              </w:rPr>
-            </w:pPr>
-            <w:r>
-              <w:rPr>
-                <w:lang w:val="de-DE"/>
-              </w:rPr>
-              <w:t>Der Faktor ½ kommt daher, dass die Spannung beim Aufladen erst von null auf ihren Endwert anwächst – im Mittel wird nur gegen die halbe Endspannung gearbeitet.</w:t>
-            </w:r>
-          </w:p>
-        </w:tc>
-      </w:tr>
-    </w:tbl>
     <w:p>
       <w:pPr>
         <w:rPr>

</xml_diff>